<commit_message>
feat: add drag and drop support for reordering categories and sub-concepts
</commit_message>
<xml_diff>
--- a/Proceso para la actualizacion de la App en la WEB (Vercel y en github).docx
+++ b/Proceso para la actualizacion de la App en la WEB (Vercel y en github).docx
@@ -56,6 +56,7 @@
       </w:pPr>
       <w:r>
         <w:rPr>
+          <w:noProof/>
           <w:sz w:val="20"/>
           <w:szCs w:val="20"/>
         </w:rPr>
@@ -1305,16 +1306,28 @@
         <w:rPr>
           <w:highlight w:val="yellow"/>
         </w:rPr>
-        <w:t xml:space="preserve"> -m "cambio de </w:t>
-      </w:r>
-      <w:proofErr w:type="spellStart"/>
+        <w:t xml:space="preserve"> -m "</w:t>
+      </w:r>
       <w:r>
         <w:rPr>
           <w:highlight w:val="yellow"/>
         </w:rPr>
-        <w:t>titulo</w:t>
-      </w:r>
-      <w:proofErr w:type="spellEnd"/>
+        <w:t xml:space="preserve">modo noche y </w:t>
+      </w:r>
+      <w:proofErr w:type="spellStart"/>
+      <w:r>
+        <w:rPr>
+          <w:highlight w:val="yellow"/>
+        </w:rPr>
+        <w:t>chatbot</w:t>
+      </w:r>
+      <w:proofErr w:type="spellEnd"/>
+      <w:r>
+        <w:rPr>
+          <w:highlight w:val="yellow"/>
+        </w:rPr>
+        <w:t xml:space="preserve"> integrado</w:t>
+      </w:r>
       <w:r>
         <w:rPr>
           <w:highlight w:val="yellow"/>

</xml_diff>